<commit_message>
Update whitepaper documents to remove outdated references
Update white-paper.html and future-pathways-white-paper-2026.docx to remove references to "UAE Vision 2021" and add adm-zip to package.json.

Replit-Commit-Author: Agent
Replit-Commit-Session-Id: 1ff1730d-808e-42ab-9038-e7e4a8c0db8d
Replit-Commit-Checkpoint-Type: full_checkpoint
Replit-Commit-Event-Id: a36946ea-3356-47b7-b7df-cf00e35379c9
Replit-Commit-Screenshot-Url: https://storage.googleapis.com/screenshot-production-us-central1/46781757-2995-4279-9668-5cbf554ead29/1ff1730d-808e-42ab-9038-e7e4a8c0db8d/PEuPZe5
Replit-Helium-Checkpoint-Created: true
</commit_message>
<xml_diff>
--- a/docs/future-pathways-white-paper-2026.docx
+++ b/docs/future-pathways-white-paper-2026.docx
@@ -469,7 +469,7 @@
         <w:spacing w:before="60" w:after="60"/>
       </w:pPr>
       <w:r>
-        <w:t>Government alignment: explicitly designed to support UAE Vision 2021, UAE Centennial 2071, and UAE Agenda 2031 — making the platform a natural candidate for public sector endorsement and procurement.</w:t>
+        <w:t>Government alignment: explicitly designed to support UAE Centennial 2071 and We the UAE 2031 — making the platform a natural candidate for public sector endorsement and procurement.</w:t>
       </w:r>
     </w:p>
     <w:p>
@@ -561,7 +561,7 @@
         <w:t>programs</w:t>
       </w:r>
       <w:r>
-        <w:t xml:space="preserve"> — UAE Vision 2021, UAE Centennial 2071, and UAE Agenda 2031 — share a common dependency: a highly skilled, future-ready national workforce. Yet the infrastructure to guide students towards that workforce remains underdeveloped in secondary schools.</w:t>
+        <w:t xml:space="preserve"> — UAE Centennial 2071 and We the UAE 2031 — share a common dependency: a highly skilled, future-ready national workforce. Yet the infrastructure to guide students towards that workforce remains underdeveloped in secondary schools.</w:t>
       </w:r>
     </w:p>
     <w:p>

</xml_diff>